<commit_message>
Clarify Lloyds RDS event workflow and shorten supplementary instructions
</commit_message>
<xml_diff>
--- a/reporting/docs/generated/Lloyds-Supplementary-Jan-2026.docx
+++ b/reporting/docs/generated/Lloyds-Supplementary-Jan-2026.docx
@@ -49,7 +49,7 @@
       </w:r>
     </w:p>
     <w:p>
-      <w:bookmarkStart w:id="1" w:name="bm_lloyds_runbook_lloyd_s_rds_and_supplementary"/>
+      <w:bookmarkStart w:id="1" w:name="bm_lloyds_runbook_lloyd_s_rds_and_supplementary_reports"/>
       <w:pPr>
         <w:pStyle w:val="Heading1"/>
         <w:keepNext/>
@@ -59,59 +59,20 @@
           <w:b w:val="0"/>
           <w:i w:val="0"/>
         </w:rPr>
-        <w:t>Lloyd's — RDS and Supplementary</w:t>
+        <w:t>Lloyd's — RDS and supplementary reports</w:t>
       </w:r>
       <w:bookmarkEnd w:id="1"/>
     </w:p>
     <w:p>
-      <w:r>
-        <w:rPr>
-          <w:b w:val="0"/>
-          <w:i w:val="0"/>
-        </w:rPr>
-        <w:t xml:space="preserve">Work from the </w:t>
-      </w:r>
-      <w:r>
-        <w:rPr>
-          <w:rFonts w:ascii="Courier New" w:hAnsi="Courier New"/>
-          <w:b w:val="0"/>
-          <w:i w:val="0"/>
-          <w:sz w:val="18"/>
-        </w:rPr>
-        <w:t>reporting/</w:t>
-      </w:r>
-      <w:r>
-        <w:rPr>
-          <w:b w:val="0"/>
-          <w:i w:val="0"/>
-        </w:rPr>
-        <w:t xml:space="preserve"> directory. Use working copies from </w:t>
-      </w:r>
-      <w:r>
-        <w:rPr>
-          <w:rFonts w:ascii="Courier New" w:hAnsi="Courier New"/>
-          <w:b w:val="0"/>
-          <w:i w:val="0"/>
-          <w:sz w:val="18"/>
-        </w:rPr>
-        <w:t>lloyds/workbooks/</w:t>
-      </w:r>
-      <w:r>
-        <w:rPr>
-          <w:b w:val="0"/>
-          <w:i w:val="0"/>
-        </w:rPr>
-        <w:t>; match the filename endings below. The checked-in files are workings/source evidence, not the final RDS submission template. Do not treat cached values, embedded emails, or a successful SQL command as producer or approval evidence.</w:t>
-      </w:r>
-    </w:p>
-    <w:p>
-      <w:r>
-        <w:rPr>
-          <w:b w:val="0"/>
-          <w:i w:val="0"/>
-        </w:rPr>
-        <w:t>Before every branch, confirm the approved reporting-period source, producer, measure (gross/net), currency/unit, FX date/direction, scale/retention factors, geography mapping, and final destination. The SQL files require an external EDM/SQL Server and credentials; no database connection is available in this repository. Run an approved SQL client from the stated working directory and retain the exact command, database identity, parameters, raw export, and reconciliations.</w:t>
-      </w:r>
+      <w:hyperlink r:id="rId9">
+        <w:r>
+          <w:rPr>
+            <w:color w:val="0563C1"/>
+            <w:u w:val="single"/>
+          </w:rPr>
+          <w:t>Back to reporting guides</w:t>
+        </w:r>
+      </w:hyperlink>
     </w:p>
     <w:p>
       <w:bookmarkStart w:id="2" w:name="bm_lloyds_runbook_rds_events"/>
@@ -124,9 +85,24 @@
           <w:b w:val="0"/>
           <w:i w:val="0"/>
         </w:rPr>
-        <w:t>RDS Events</w:t>
+        <w:t>RDS events</w:t>
       </w:r>
       <w:bookmarkEnd w:id="2"/>
+    </w:p>
+    <w:p>
+      <w:bookmarkStart w:id="3" w:name="bm_lloyds_runbook_1_open_the_event_list_and_reporting_workbook"/>
+      <w:pPr>
+        <w:pStyle w:val="Heading3"/>
+        <w:keepNext/>
+      </w:pPr>
+      <w:r>
+        <w:rPr>
+          <w:b w:val="0"/>
+          <w:i w:val="0"/>
+        </w:rPr>
+        <w:t>1. Open the event list and reporting workbook</w:t>
+      </w:r>
+      <w:bookmarkEnd w:id="3"/>
     </w:p>
     <w:p>
       <w:r>
@@ -134,7 +110,277 @@
           <w:b w:val="0"/>
           <w:i w:val="0"/>
         </w:rPr>
-        <w:t xml:space="preserve">The RDS events are selected from the ELTs using the </w:t>
+        <w:t xml:space="preserve">• </w:t>
+      </w:r>
+      <w:hyperlink r:id="rId10">
+        <w:r>
+          <w:rPr>
+            <w:color w:val="0563C1"/>
+            <w:u w:val="single"/>
+          </w:rPr>
+          <w:t>Event IDs</w:t>
+        </w:r>
+      </w:hyperlink>
+      <w:r>
+        <w:rPr>
+          <w:b w:val="0"/>
+          <w:i w:val="0"/>
+        </w:rPr>
+        <w:t xml:space="preserve"> — which model events to extract.</w:t>
+      </w:r>
+    </w:p>
+    <w:p>
+      <w:r>
+        <w:rPr>
+          <w:b w:val="0"/>
+          <w:i w:val="0"/>
+        </w:rPr>
+        <w:t xml:space="preserve">• </w:t>
+      </w:r>
+      <w:hyperlink r:id="rId11">
+        <w:r>
+          <w:rPr>
+            <w:color w:val="0563C1"/>
+            <w:u w:val="single"/>
+          </w:rPr>
+          <w:t>RDS workbook</w:t>
+        </w:r>
+      </w:hyperlink>
+      <w:r>
+        <w:rPr>
+          <w:b w:val="0"/>
+          <w:i w:val="0"/>
+        </w:rPr>
+        <w:t xml:space="preserve"> — where the results go.</w:t>
+      </w:r>
+    </w:p>
+    <w:p>
+      <w:r>
+        <w:rPr>
+          <w:b w:val="0"/>
+          <w:i w:val="0"/>
+        </w:rPr>
+        <w:t xml:space="preserve">Choose the correct period: the workbook contains </w:t>
+      </w:r>
+      <w:r>
+        <w:rPr>
+          <w:rFonts w:ascii="Courier New" w:hAnsi="Courier New"/>
+          <w:b/>
+          <w:i w:val="0"/>
+          <w:sz w:val="18"/>
+        </w:rPr>
+        <w:t>1.1.26 RDS Input</w:t>
+      </w:r>
+      <w:r>
+        <w:rPr>
+          <w:b w:val="0"/>
+          <w:i w:val="0"/>
+        </w:rPr>
+        <w:t xml:space="preserve"> and </w:t>
+      </w:r>
+      <w:r>
+        <w:rPr>
+          <w:rFonts w:ascii="Courier New" w:hAnsi="Courier New"/>
+          <w:b/>
+          <w:i w:val="0"/>
+          <w:sz w:val="18"/>
+        </w:rPr>
+        <w:t>1.4.2026 RDS Input</w:t>
+      </w:r>
+      <w:r>
+        <w:rPr>
+          <w:b w:val="0"/>
+          <w:i w:val="0"/>
+        </w:rPr>
+        <w:t xml:space="preserve"> tabs. Do not overwrite another period.</w:t>
+      </w:r>
+    </w:p>
+    <w:p>
+      <w:bookmarkStart w:id="4" w:name="bm_lloyds_runbook_2_extract_the_model_losses"/>
+      <w:pPr>
+        <w:pStyle w:val="Heading3"/>
+        <w:keepNext/>
+      </w:pPr>
+      <w:r>
+        <w:rPr>
+          <w:b w:val="0"/>
+          <w:i w:val="0"/>
+        </w:rPr>
+        <w:t>2. Extract the model losses</w:t>
+      </w:r>
+      <w:bookmarkEnd w:id="4"/>
+    </w:p>
+    <w:p>
+      <w:r>
+        <w:rPr>
+          <w:b w:val="0"/>
+          <w:i w:val="0"/>
+        </w:rPr>
+        <w:t>Use the approved reporting-period ELTs and portfolios/classes.</w:t>
+      </w:r>
+    </w:p>
+    <w:tbl>
+      <w:tblPr>
+        <w:tblStyle w:val="TableGrid"/>
+        <w:tblW w:type="auto" w:w="0"/>
+        <w:tblLook w:firstColumn="1" w:firstRow="1" w:lastColumn="0" w:lastRow="0" w:noHBand="0" w:noVBand="1" w:val="04A0"/>
+      </w:tblPr>
+      <w:tblGrid>
+        <w:gridCol w:w="5040"/>
+        <w:gridCol w:w="5040"/>
+      </w:tblGrid>
+      <w:tr>
+        <w:tc>
+          <w:tcPr>
+            <w:tcW w:type="dxa" w:w="5040"/>
+            <w:shd w:fill="D9EAF7"/>
+          </w:tcPr>
+          <w:p>
+            <w:r>
+              <w:rPr>
+                <w:b/>
+              </w:rPr>
+            </w:r>
+            <w:r>
+              <w:rPr>
+                <w:b/>
+                <w:i w:val="0"/>
+              </w:rPr>
+              <w:t>Model</w:t>
+            </w:r>
+          </w:p>
+        </w:tc>
+        <w:tc>
+          <w:tcPr>
+            <w:tcW w:type="dxa" w:w="5040"/>
+            <w:shd w:fill="D9EAF7"/>
+          </w:tcPr>
+          <w:p>
+            <w:r>
+              <w:rPr>
+                <w:b/>
+              </w:rPr>
+            </w:r>
+            <w:r>
+              <w:rPr>
+                <w:b/>
+                <w:i w:val="0"/>
+              </w:rPr>
+              <w:t>Selection key</w:t>
+            </w:r>
+          </w:p>
+        </w:tc>
+      </w:tr>
+      <w:tr>
+        <w:tc>
+          <w:tcPr>
+            <w:tcW w:type="dxa" w:w="5040"/>
+          </w:tcPr>
+          <w:p>
+            <w:r/>
+            <w:r>
+              <w:rPr>
+                <w:b w:val="0"/>
+                <w:i w:val="0"/>
+              </w:rPr>
+              <w:t>Verisk / AIR / Touchstone</w:t>
+            </w:r>
+          </w:p>
+        </w:tc>
+        <w:tc>
+          <w:tcPr>
+            <w:tcW w:type="dxa" w:w="5040"/>
+          </w:tcPr>
+          <w:p>
+            <w:r/>
+            <w:r>
+              <w:rPr>
+                <w:b/>
+                <w:i w:val="0"/>
+              </w:rPr>
+              <w:t>Event AND Year</w:t>
+            </w:r>
+            <w:r>
+              <w:rPr>
+                <w:b w:val="0"/>
+                <w:i w:val="0"/>
+              </w:rPr>
+              <w:t xml:space="preserve"> from the event list</w:t>
+            </w:r>
+          </w:p>
+        </w:tc>
+      </w:tr>
+      <w:tr>
+        <w:tc>
+          <w:tcPr>
+            <w:tcW w:type="dxa" w:w="5040"/>
+          </w:tcPr>
+          <w:p>
+            <w:r/>
+            <w:r>
+              <w:rPr>
+                <w:b w:val="0"/>
+                <w:i w:val="0"/>
+              </w:rPr>
+              <w:t>RMS / Risklink</w:t>
+            </w:r>
+          </w:p>
+        </w:tc>
+        <w:tc>
+          <w:tcPr>
+            <w:tcW w:type="dxa" w:w="5040"/>
+          </w:tcPr>
+          <w:p>
+            <w:r/>
+            <w:r>
+              <w:rPr>
+                <w:b w:val="0"/>
+                <w:i w:val="0"/>
+              </w:rPr>
+              <w:t>The corresponding RMS event ID</w:t>
+            </w:r>
+          </w:p>
+        </w:tc>
+      </w:tr>
+    </w:tbl>
+    <w:p/>
+    <w:p>
+      <w:r>
+        <w:rPr>
+          <w:b w:val="0"/>
+          <w:i w:val="0"/>
+        </w:rPr>
+        <w:t xml:space="preserve">Do not select AIR events by event number alone: numbers repeat across years. For example, the Northeast Hurricane selection is </w:t>
+      </w:r>
+      <w:r>
+        <w:rPr>
+          <w:b/>
+          <w:i w:val="0"/>
+        </w:rPr>
+        <w:t>Event 1, Year 103</w:t>
+      </w:r>
+      <w:r>
+        <w:rPr>
+          <w:b w:val="0"/>
+          <w:i w:val="0"/>
+        </w:rPr>
+        <w:t>. Confirm the event mapping applies to the model version being used.</w:t>
+      </w:r>
+    </w:p>
+    <w:p>
+      <w:r>
+        <w:rPr>
+          <w:b/>
+          <w:i w:val="0"/>
+        </w:rPr>
+        <w:t>UK flood needs its selection supplied:</w:t>
+      </w:r>
+      <w:r>
+        <w:rPr>
+          <w:b w:val="0"/>
+          <w:i w:val="0"/>
+        </w:rPr>
+        <w:t xml:space="preserve"> it is absent from the event-ID list, and its model-ID cells in </w:t>
       </w:r>
       <w:r>
         <w:rPr>
@@ -143,14 +389,14 @@
           <w:i w:val="0"/>
           <w:sz w:val="18"/>
         </w:rPr>
-        <w:t>lloyds/rds/eventids_for_rds.xlsx</w:t>
+        <w:t>EventDetails</w:t>
       </w:r>
       <w:r>
         <w:rPr>
           <w:b w:val="0"/>
           <w:i w:val="0"/>
         </w:rPr>
-        <w:t xml:space="preserve"> workbook (path relative to </w:t>
+        <w:t xml:space="preserve"> are blank. The checked-in </w:t>
       </w:r>
       <w:r>
         <w:rPr>
@@ -159,14 +405,47 @@
           <w:i w:val="0"/>
           <w:sz w:val="18"/>
         </w:rPr>
-        <w:t>reporting/</w:t>
+        <w:t>rds-event-select.sql</w:t>
       </w:r>
       <w:r>
         <w:rPr>
           <w:b w:val="0"/>
           <w:i w:val="0"/>
         </w:rPr>
-        <w:t>).</w:t>
+        <w:t xml:space="preserve"> is also empty; it is not a runnable extraction query.</w:t>
+      </w:r>
+    </w:p>
+    <w:p>
+      <w:bookmarkStart w:id="5" w:name="bm_lloyds_runbook_3_apply_the_agreed_model_blend"/>
+      <w:pPr>
+        <w:pStyle w:val="Heading3"/>
+        <w:keepNext/>
+      </w:pPr>
+      <w:r>
+        <w:rPr>
+          <w:b w:val="0"/>
+          <w:i w:val="0"/>
+        </w:rPr>
+        <w:t>3. Apply the agreed model blend</w:t>
+      </w:r>
+      <w:bookmarkEnd w:id="5"/>
+    </w:p>
+    <w:p>
+      <w:r>
+        <w:rPr>
+          <w:b w:val="0"/>
+          <w:i w:val="0"/>
+        </w:rPr>
+        <w:t>Put model losses on the same class, financial-term and currency basis first. Where a blend applies, use:</w:t>
+      </w:r>
+    </w:p>
+    <w:p>
+      <w:r>
+        <w:rPr>
+          <w:b/>
+          <w:i w:val="0"/>
+        </w:rPr>
+        <w:t>Blended loss = Verisk weight × Verisk loss + Risklink weight × Risklink loss.</w:t>
       </w:r>
     </w:p>
     <w:p>
@@ -175,7 +454,131 @@
           <w:b w:val="0"/>
           <w:i w:val="0"/>
         </w:rPr>
-        <w:t>This lists the events to be selected from both Verisk and Risklink.</w:t>
+        <w:t xml:space="preserve">The recorded EU windstorm approach is </w:t>
+      </w:r>
+      <w:r>
+        <w:rPr>
+          <w:b/>
+          <w:i w:val="0"/>
+        </w:rPr>
+        <w:t>100% Risklink</w:t>
+      </w:r>
+      <w:r>
+        <w:rPr>
+          <w:b w:val="0"/>
+          <w:i w:val="0"/>
+        </w:rPr>
+        <w:t>: use the Risklink loss. For other perils, obtain the agreed weights; do not assume 50/50 or add both models at full weight. The January 2026 notes say only EU windstorm and UK flood were refreshed then—do not assume the other cached events are current.</w:t>
+      </w:r>
+    </w:p>
+    <w:p>
+      <w:bookmarkStart w:id="6" w:name="bm_lloyds_runbook_4_update_and_check_the_rds_rows"/>
+      <w:pPr>
+        <w:pStyle w:val="Heading3"/>
+        <w:keepNext/>
+      </w:pPr>
+      <w:r>
+        <w:rPr>
+          <w:b w:val="0"/>
+          <w:i w:val="0"/>
+        </w:rPr>
+        <w:t>4. Update and check the RDS rows</w:t>
+      </w:r>
+      <w:bookmarkEnd w:id="6"/>
+    </w:p>
+    <w:p>
+      <w:r>
+        <w:rPr>
+          <w:b w:val="0"/>
+          <w:i w:val="0"/>
+        </w:rPr>
+        <w:t xml:space="preserve">Match each result to </w:t>
+      </w:r>
+      <w:r>
+        <w:rPr>
+          <w:b/>
+          <w:i w:val="0"/>
+        </w:rPr>
+        <w:t>Event + Class</w:t>
+      </w:r>
+      <w:r>
+        <w:rPr>
+          <w:b w:val="0"/>
+          <w:i w:val="0"/>
+        </w:rPr>
+        <w:t xml:space="preserve"> in the chosen </w:t>
+      </w:r>
+      <w:r>
+        <w:rPr>
+          <w:rFonts w:ascii="Courier New" w:hAnsi="Courier New"/>
+          <w:b w:val="0"/>
+          <w:i w:val="0"/>
+          <w:sz w:val="18"/>
+        </w:rPr>
+        <w:t>RDS Input</w:t>
+      </w:r>
+      <w:r>
+        <w:rPr>
+          <w:b w:val="0"/>
+          <w:i w:val="0"/>
+        </w:rPr>
+        <w:t xml:space="preserve"> tab. Enter losses under </w:t>
+      </w:r>
+      <w:r>
+        <w:rPr>
+          <w:b/>
+          <w:i w:val="0"/>
+        </w:rPr>
+        <w:t>Gross Loss</w:t>
+      </w:r>
+      <w:r>
+        <w:rPr>
+          <w:b w:val="0"/>
+          <w:i w:val="0"/>
+        </w:rPr>
+        <w:t xml:space="preserve">, check </w:t>
+      </w:r>
+      <w:r>
+        <w:rPr>
+          <w:b/>
+          <w:i w:val="0"/>
+        </w:rPr>
+        <w:t>Currency</w:t>
+      </w:r>
+      <w:r>
+        <w:rPr>
+          <w:b w:val="0"/>
+          <w:i w:val="0"/>
+        </w:rPr>
+        <w:t xml:space="preserve">, and keep </w:t>
+      </w:r>
+      <w:r>
+        <w:rPr>
+          <w:b/>
+          <w:i w:val="0"/>
+        </w:rPr>
+        <w:t>Aggregate</w:t>
+      </w:r>
+      <w:r>
+        <w:rPr>
+          <w:b w:val="0"/>
+          <w:i w:val="0"/>
+        </w:rPr>
+        <w:t xml:space="preserve"> (exposure) and </w:t>
+      </w:r>
+      <w:r>
+        <w:rPr>
+          <w:b/>
+          <w:i w:val="0"/>
+        </w:rPr>
+        <w:t>Gross Reinstatement Premium Recoveries</w:t>
+      </w:r>
+      <w:r>
+        <w:rPr>
+          <w:b w:val="0"/>
+          <w:i w:val="0"/>
+        </w:rPr>
+        <w:t xml:space="preserve"> separate. Do not paste losses into exposure columns or overwrite the scenario labels.</w:t>
       </w:r>
     </w:p>
     <w:p>
@@ -184,29 +587,11 @@
           <w:b w:val="0"/>
           <w:i w:val="0"/>
         </w:rPr>
-        <w:t>Select the eventids and copy the results to the RDS workbook ('2026 Lloyds RDS UKEU Retail.xlsx')</w:t>
+        <w:t>Check every required event/class, currency and blend against the source extracts. Keep the extracts and weights with the completed working copy; obtain review before submission.</w:t>
       </w:r>
     </w:p>
     <w:p>
-      <w:r>
-        <w:rPr>
-          <w:b w:val="0"/>
-          <w:i w:val="0"/>
-        </w:rPr>
-        <w:t>Where possible the blending approach was used, e.g. EU WS is 100% weighted to risklink therefore the risklink loss was used.</w:t>
-      </w:r>
-    </w:p>
-    <w:p>
-      <w:r>
-        <w:rPr>
-          <w:b w:val="0"/>
-          <w:i w:val="0"/>
-        </w:rPr>
-        <w:t>As of January 2026 only EUWS and UKFL were the only perils to be updated. Going forward you should have model results for international perils, therefore the blending will need to be done on the RDS losses too.</w:t>
-      </w:r>
-    </w:p>
-    <w:p>
-      <w:bookmarkStart w:id="3" w:name="bm_lloyds_runbook_south_africa"/>
+      <w:bookmarkStart w:id="7" w:name="bm_lloyds_runbook_supplementary_exposure_reports"/>
       <w:pPr>
         <w:pStyle w:val="Heading2"/>
         <w:keepNext/>
@@ -216,9 +601,9 @@
           <w:b w:val="0"/>
           <w:i w:val="0"/>
         </w:rPr>
-        <w:t>South Africa</w:t>
+        <w:t>Supplementary exposure reports</w:t>
       </w:r>
-      <w:bookmarkEnd w:id="3"/>
+      <w:bookmarkEnd w:id="7"/>
     </w:p>
     <w:p>
       <w:r>
@@ -226,7 +611,555 @@
           <w:b w:val="0"/>
           <w:i w:val="0"/>
         </w:rPr>
-        <w:t xml:space="preserve">1. Review and approve </w:t>
+        <w:t xml:space="preserve">Use working copies from </w:t>
+      </w:r>
+      <w:hyperlink r:id="rId12">
+        <w:r>
+          <w:rPr>
+            <w:color w:val="0563C1"/>
+            <w:u w:val="single"/>
+          </w:rPr>
+          <w:t>lloyds/workbooks/</w:t>
+        </w:r>
+      </w:hyperlink>
+      <w:r>
+        <w:rPr>
+          <w:b w:val="0"/>
+          <w:i w:val="0"/>
+        </w:rPr>
+        <w:t xml:space="preserve">. SQL files are in </w:t>
+      </w:r>
+      <w:hyperlink r:id="rId13">
+        <w:r>
+          <w:rPr>
+            <w:color w:val="0563C1"/>
+            <w:u w:val="single"/>
+          </w:rPr>
+          <w:t>lloyds/sql/</w:t>
+        </w:r>
+      </w:hyperlink>
+      <w:r>
+        <w:rPr>
+          <w:b w:val="0"/>
+          <w:i w:val="0"/>
+        </w:rPr>
+        <w:t xml:space="preserve">. Confirm the database/report date before running them: they contain fixed database, peril and portfolio settings. Paste </w:t>
+      </w:r>
+      <w:r>
+        <w:rPr>
+          <w:b/>
+          <w:i w:val="0"/>
+        </w:rPr>
+        <w:t>data only below existing headers</w:t>
+      </w:r>
+      <w:r>
+        <w:rPr>
+          <w:b w:val="0"/>
+          <w:i w:val="0"/>
+        </w:rPr>
+        <w:t>, preserving helper columns.</w:t>
+      </w:r>
+    </w:p>
+    <w:tbl>
+      <w:tblPr>
+        <w:tblStyle w:val="TableGrid"/>
+        <w:tblW w:type="auto" w:w="0"/>
+        <w:tblLook w:firstColumn="1" w:firstRow="1" w:lastColumn="0" w:lastRow="0" w:noHBand="0" w:noVBand="1" w:val="04A0"/>
+      </w:tblPr>
+      <w:tblGrid>
+        <w:gridCol w:w="2520"/>
+        <w:gridCol w:w="2520"/>
+        <w:gridCol w:w="2520"/>
+        <w:gridCol w:w="2520"/>
+      </w:tblGrid>
+      <w:tr>
+        <w:tc>
+          <w:tcPr>
+            <w:tcW w:type="dxa" w:w="2520"/>
+            <w:shd w:fill="D9EAF7"/>
+          </w:tcPr>
+          <w:p>
+            <w:r>
+              <w:rPr>
+                <w:b/>
+              </w:rPr>
+            </w:r>
+            <w:r>
+              <w:rPr>
+                <w:b/>
+                <w:i w:val="0"/>
+              </w:rPr>
+              <w:t>Report</w:t>
+            </w:r>
+          </w:p>
+        </w:tc>
+        <w:tc>
+          <w:tcPr>
+            <w:tcW w:type="dxa" w:w="2520"/>
+            <w:shd w:fill="D9EAF7"/>
+          </w:tcPr>
+          <w:p>
+            <w:r>
+              <w:rPr>
+                <w:b/>
+              </w:rPr>
+            </w:r>
+            <w:r>
+              <w:rPr>
+                <w:b/>
+                <w:i w:val="0"/>
+              </w:rPr>
+              <w:t>Source</w:t>
+            </w:r>
+          </w:p>
+        </w:tc>
+        <w:tc>
+          <w:tcPr>
+            <w:tcW w:type="dxa" w:w="2520"/>
+            <w:shd w:fill="D9EAF7"/>
+          </w:tcPr>
+          <w:p>
+            <w:r>
+              <w:rPr>
+                <w:b/>
+              </w:rPr>
+            </w:r>
+            <w:r>
+              <w:rPr>
+                <w:b/>
+                <w:i w:val="0"/>
+              </w:rPr>
+              <w:t>Paste into</w:t>
+            </w:r>
+          </w:p>
+        </w:tc>
+        <w:tc>
+          <w:tcPr>
+            <w:tcW w:type="dxa" w:w="2520"/>
+            <w:shd w:fill="D9EAF7"/>
+          </w:tcPr>
+          <w:p>
+            <w:r>
+              <w:rPr>
+                <w:b/>
+              </w:rPr>
+            </w:r>
+            <w:r>
+              <w:rPr>
+                <w:b/>
+                <w:i w:val="0"/>
+              </w:rPr>
+              <w:t>Preserve / report</w:t>
+            </w:r>
+          </w:p>
+        </w:tc>
+      </w:tr>
+      <w:tr>
+        <w:tc>
+          <w:tcPr>
+            <w:tcW w:type="dxa" w:w="2520"/>
+          </w:tcPr>
+          <w:p>
+            <w:r/>
+            <w:r>
+              <w:rPr>
+                <w:b w:val="0"/>
+                <w:i w:val="0"/>
+              </w:rPr>
+              <w:t>South Africa</w:t>
+            </w:r>
+          </w:p>
+        </w:tc>
+        <w:tc>
+          <w:tcPr>
+            <w:tcW w:type="dxa" w:w="2520"/>
+          </w:tcPr>
+          <w:p>
+            <w:r/>
+            <w:r>
+              <w:rPr>
+                <w:rFonts w:ascii="Courier New" w:hAnsi="Courier New"/>
+                <w:b w:val="0"/>
+                <w:i w:val="0"/>
+                <w:sz w:val="18"/>
+              </w:rPr>
+              <w:t>SouthAfrica_Aggs.sql</w:t>
+            </w:r>
+          </w:p>
+        </w:tc>
+        <w:tc>
+          <w:tcPr>
+            <w:tcW w:type="dxa" w:w="2520"/>
+          </w:tcPr>
+          <w:p>
+            <w:r/>
+            <w:r>
+              <w:rPr>
+                <w:b w:val="0"/>
+                <w:i w:val="0"/>
+              </w:rPr>
+              <w:t xml:space="preserve">South Africa EQ workbook, </w:t>
+            </w:r>
+            <w:r>
+              <w:rPr>
+                <w:rFonts w:ascii="Courier New" w:hAnsi="Courier New"/>
+                <w:b w:val="0"/>
+                <w:i w:val="0"/>
+                <w:sz w:val="18"/>
+              </w:rPr>
+              <w:t>Core data!A2</w:t>
+            </w:r>
+            <w:r>
+              <w:rPr>
+                <w:b w:val="0"/>
+                <w:i w:val="0"/>
+              </w:rPr>
+              <w:t xml:space="preserve"> (A:R)</w:t>
+            </w:r>
+          </w:p>
+        </w:tc>
+        <w:tc>
+          <w:tcPr>
+            <w:tcW w:type="dxa" w:w="2520"/>
+          </w:tcPr>
+          <w:p>
+            <w:r/>
+            <w:r>
+              <w:rPr>
+                <w:b w:val="0"/>
+                <w:i w:val="0"/>
+              </w:rPr>
+              <w:t xml:space="preserve">S:U; </w:t>
+            </w:r>
+            <w:r>
+              <w:rPr>
+                <w:rFonts w:ascii="Courier New" w:hAnsi="Courier New"/>
+                <w:b w:val="0"/>
+                <w:i w:val="0"/>
+                <w:sz w:val="18"/>
+              </w:rPr>
+              <w:t>05 South Africa EQ Aggs</w:t>
+            </w:r>
+          </w:p>
+        </w:tc>
+      </w:tr>
+      <w:tr>
+        <w:tc>
+          <w:tcPr>
+            <w:tcW w:type="dxa" w:w="2520"/>
+          </w:tcPr>
+          <w:p>
+            <w:r/>
+            <w:r>
+              <w:rPr>
+                <w:b w:val="0"/>
+                <w:i w:val="0"/>
+              </w:rPr>
+              <w:t>California</w:t>
+            </w:r>
+          </w:p>
+        </w:tc>
+        <w:tc>
+          <w:tcPr>
+            <w:tcW w:type="dxa" w:w="2520"/>
+          </w:tcPr>
+          <w:p>
+            <w:r/>
+            <w:r>
+              <w:rPr>
+                <w:rFonts w:ascii="Courier New" w:hAnsi="Courier New"/>
+                <w:b w:val="0"/>
+                <w:i w:val="0"/>
+                <w:sz w:val="18"/>
+              </w:rPr>
+              <w:t>FA_California_Aggs.sql</w:t>
+            </w:r>
+          </w:p>
+        </w:tc>
+        <w:tc>
+          <w:tcPr>
+            <w:tcW w:type="dxa" w:w="2520"/>
+          </w:tcPr>
+          <w:p>
+            <w:r/>
+            <w:r>
+              <w:rPr>
+                <w:b w:val="0"/>
+                <w:i w:val="0"/>
+              </w:rPr>
+              <w:t xml:space="preserve">California WF workbook, </w:t>
+            </w:r>
+            <w:r>
+              <w:rPr>
+                <w:rFonts w:ascii="Courier New" w:hAnsi="Courier New"/>
+                <w:b w:val="0"/>
+                <w:i w:val="0"/>
+                <w:sz w:val="18"/>
+              </w:rPr>
+              <w:t>Core data!A2</w:t>
+            </w:r>
+            <w:r>
+              <w:rPr>
+                <w:b w:val="0"/>
+                <w:i w:val="0"/>
+              </w:rPr>
+              <w:t xml:space="preserve"> (A:M)</w:t>
+            </w:r>
+          </w:p>
+        </w:tc>
+        <w:tc>
+          <w:tcPr>
+            <w:tcW w:type="dxa" w:w="2520"/>
+          </w:tcPr>
+          <w:p>
+            <w:r/>
+            <w:r>
+              <w:rPr>
+                <w:b w:val="0"/>
+                <w:i w:val="0"/>
+              </w:rPr>
+              <w:t xml:space="preserve">N; </w:t>
+            </w:r>
+            <w:r>
+              <w:rPr>
+                <w:rFonts w:ascii="Courier New" w:hAnsi="Courier New"/>
+                <w:b w:val="0"/>
+                <w:i w:val="0"/>
+                <w:sz w:val="18"/>
+              </w:rPr>
+              <w:t>06 California Wildfire Aggs</w:t>
+            </w:r>
+          </w:p>
+        </w:tc>
+      </w:tr>
+      <w:tr>
+        <w:tc>
+          <w:tcPr>
+            <w:tcW w:type="dxa" w:w="2520"/>
+          </w:tcPr>
+          <w:p>
+            <w:r/>
+            <w:r>
+              <w:rPr>
+                <w:b w:val="0"/>
+                <w:i w:val="0"/>
+              </w:rPr>
+              <w:t>Rest of World</w:t>
+            </w:r>
+          </w:p>
+        </w:tc>
+        <w:tc>
+          <w:tcPr>
+            <w:tcW w:type="dxa" w:w="2520"/>
+          </w:tcPr>
+          <w:p>
+            <w:r/>
+            <w:r>
+              <w:rPr>
+                <w:b w:val="0"/>
+                <w:i w:val="0"/>
+              </w:rPr>
+              <w:t>Separate EQ, FR, FL and WS extracts</w:t>
+            </w:r>
+          </w:p>
+        </w:tc>
+        <w:tc>
+          <w:tcPr>
+            <w:tcW w:type="dxa" w:w="2520"/>
+          </w:tcPr>
+          <w:p>
+            <w:r/>
+            <w:r>
+              <w:rPr>
+                <w:b w:val="0"/>
+                <w:i w:val="0"/>
+              </w:rPr>
+              <w:t xml:space="preserve">ROW workbook, matching extract sheet </w:t>
+            </w:r>
+            <w:r>
+              <w:rPr>
+                <w:rFonts w:ascii="Courier New" w:hAnsi="Courier New"/>
+                <w:b w:val="0"/>
+                <w:i w:val="0"/>
+                <w:sz w:val="18"/>
+              </w:rPr>
+              <w:t>A2</w:t>
+            </w:r>
+            <w:r>
+              <w:rPr>
+                <w:b w:val="0"/>
+                <w:i w:val="0"/>
+              </w:rPr>
+              <w:t xml:space="preserve"> (A:K)</w:t>
+            </w:r>
+          </w:p>
+        </w:tc>
+        <w:tc>
+          <w:tcPr>
+            <w:tcW w:type="dxa" w:w="2520"/>
+          </w:tcPr>
+          <w:p>
+            <w:r/>
+            <w:r>
+              <w:rPr>
+                <w:b w:val="0"/>
+                <w:i w:val="0"/>
+              </w:rPr>
+              <w:t xml:space="preserve">L:M; </w:t>
+            </w:r>
+            <w:r>
+              <w:rPr>
+                <w:rFonts w:ascii="Courier New" w:hAnsi="Courier New"/>
+                <w:b w:val="0"/>
+                <w:i w:val="0"/>
+                <w:sz w:val="18"/>
+              </w:rPr>
+              <w:t>3. RoW Exposure Monitoring</w:t>
+            </w:r>
+          </w:p>
+        </w:tc>
+      </w:tr>
+      <w:tr>
+        <w:tc>
+          <w:tcPr>
+            <w:tcW w:type="dxa" w:w="2520"/>
+          </w:tcPr>
+          <w:p>
+            <w:r/>
+            <w:r>
+              <w:rPr>
+                <w:b w:val="0"/>
+                <w:i w:val="0"/>
+              </w:rPr>
+              <w:t>Europe</w:t>
+            </w:r>
+          </w:p>
+        </w:tc>
+        <w:tc>
+          <w:tcPr>
+            <w:tcW w:type="dxa" w:w="2520"/>
+          </w:tcPr>
+          <w:p>
+            <w:r/>
+            <w:r>
+              <w:rPr>
+                <w:b w:val="0"/>
+                <w:i w:val="0"/>
+              </w:rPr>
+              <w:t>Separate EQ and FL extracts</w:t>
+            </w:r>
+          </w:p>
+        </w:tc>
+        <w:tc>
+          <w:tcPr>
+            <w:tcW w:type="dxa" w:w="2520"/>
+          </w:tcPr>
+          <w:p>
+            <w:r/>
+            <w:r>
+              <w:rPr>
+                <w:b w:val="0"/>
+                <w:i w:val="0"/>
+              </w:rPr>
+              <w:t xml:space="preserve">EU Cresta workbook, </w:t>
+            </w:r>
+            <w:r>
+              <w:rPr>
+                <w:rFonts w:ascii="Courier New" w:hAnsi="Courier New"/>
+                <w:b w:val="0"/>
+                <w:i w:val="0"/>
+                <w:sz w:val="18"/>
+              </w:rPr>
+              <w:t>Core data EQ!A2</w:t>
+            </w:r>
+            <w:r>
+              <w:rPr>
+                <w:b w:val="0"/>
+                <w:i w:val="0"/>
+              </w:rPr>
+              <w:t xml:space="preserve"> / </w:t>
+            </w:r>
+            <w:r>
+              <w:rPr>
+                <w:rFonts w:ascii="Courier New" w:hAnsi="Courier New"/>
+                <w:b w:val="0"/>
+                <w:i w:val="0"/>
+                <w:sz w:val="18"/>
+              </w:rPr>
+              <w:t>Core data FL!A2</w:t>
+            </w:r>
+            <w:r>
+              <w:rPr>
+                <w:b w:val="0"/>
+                <w:i w:val="0"/>
+              </w:rPr>
+              <w:t xml:space="preserve"> (A:R)</w:t>
+            </w:r>
+          </w:p>
+        </w:tc>
+        <w:tc>
+          <w:tcPr>
+            <w:tcW w:type="dxa" w:w="2520"/>
+          </w:tcPr>
+          <w:p>
+            <w:r/>
+            <w:r>
+              <w:rPr>
+                <w:b w:val="0"/>
+                <w:i w:val="0"/>
+              </w:rPr>
+              <w:t xml:space="preserve">S:U; </w:t>
+            </w:r>
+            <w:r>
+              <w:rPr>
+                <w:rFonts w:ascii="Courier New" w:hAnsi="Courier New"/>
+                <w:b w:val="0"/>
+                <w:i w:val="0"/>
+                <w:sz w:val="18"/>
+              </w:rPr>
+              <w:t>11 LIC EU CRESTA</w:t>
+            </w:r>
+          </w:p>
+        </w:tc>
+      </w:tr>
+    </w:tbl>
+    <w:p/>
+    <w:p>
+      <w:bookmarkStart w:id="8" w:name="bm_lloyds_runbook_resolve_these_before_using_the_reports"/>
+      <w:pPr>
+        <w:pStyle w:val="Heading3"/>
+        <w:keepNext/>
+      </w:pPr>
+      <w:r>
+        <w:rPr>
+          <w:b w:val="0"/>
+          <w:i w:val="0"/>
+        </w:rPr>
+        <w:t>Resolve these before using the reports</w:t>
+      </w:r>
+      <w:bookmarkEnd w:id="8"/>
+    </w:p>
+    <w:p>
+      <w:r>
+        <w:rPr>
+          <w:b w:val="0"/>
+          <w:i w:val="0"/>
+        </w:rPr>
+        <w:t xml:space="preserve">• </w:t>
+      </w:r>
+      <w:r>
+        <w:rPr>
+          <w:b/>
+          <w:i w:val="0"/>
+        </w:rPr>
+        <w:t>South Africa:</w:t>
+      </w:r>
+      <w:r>
+        <w:rPr>
+          <w:b w:val="0"/>
+          <w:i w:val="0"/>
+        </w:rPr>
+        <w:t xml:space="preserve"> the SQL labels currency from </w:t>
       </w:r>
       <w:r>
         <w:rPr>
@@ -235,119 +1168,14 @@
           <w:i w:val="0"/>
           <w:sz w:val="18"/>
         </w:rPr>
-        <w:t>lloyds/sql/SouthAfrica_Aggs.sql</w:t>
+        <w:t>VALUECUR</w:t>
       </w:r>
       <w:r>
         <w:rPr>
           <w:b w:val="0"/>
           <w:i w:val="0"/>
         </w:rPr>
-        <w:t xml:space="preserve"> before execution. It hard-codes </w:t>
-      </w:r>
-      <w:r>
-        <w:rPr>
-          <w:rFonts w:ascii="Courier New" w:hAnsi="Courier New"/>
-          <w:b w:val="0"/>
-          <w:i w:val="0"/>
-          <w:sz w:val="18"/>
-        </w:rPr>
-        <w:t>HISCO_UKEU_01JAN26_010126_ROLLUP_ByLOB_GC_v25_EDM</w:t>
-      </w:r>
-      <w:r>
-        <w:rPr>
-          <w:b w:val="0"/>
-          <w:i w:val="0"/>
-        </w:rPr>
-        <w:t xml:space="preserve">, </w:t>
-      </w:r>
-      <w:r>
-        <w:rPr>
-          <w:rFonts w:ascii="Courier New" w:hAnsi="Courier New"/>
-          <w:b w:val="0"/>
-          <w:i w:val="0"/>
-          <w:sz w:val="18"/>
-        </w:rPr>
-        <w:t>PERIL = 1</w:t>
-      </w:r>
-      <w:r>
-        <w:rPr>
-          <w:b w:val="0"/>
-          <w:i w:val="0"/>
-        </w:rPr>
-        <w:t xml:space="preserve">, </w:t>
-      </w:r>
-      <w:r>
-        <w:rPr>
-          <w:rFonts w:ascii="Courier New" w:hAnsi="Courier New"/>
-          <w:b w:val="0"/>
-          <w:i w:val="0"/>
-          <w:sz w:val="18"/>
-        </w:rPr>
-        <w:t>POLICYTYPE = 1</w:t>
-      </w:r>
-      <w:r>
-        <w:rPr>
-          <w:b w:val="0"/>
-          <w:i w:val="0"/>
-        </w:rPr>
-        <w:t xml:space="preserve">, </w:t>
-      </w:r>
-      <w:r>
-        <w:rPr>
-          <w:rFonts w:ascii="Courier New" w:hAnsi="Courier New"/>
-          <w:b w:val="0"/>
-          <w:i w:val="0"/>
-          <w:sz w:val="18"/>
-        </w:rPr>
-        <w:t>LOC.cntrycode = 'ZA'</w:t>
-      </w:r>
-      <w:r>
-        <w:rPr>
-          <w:b w:val="0"/>
-          <w:i w:val="0"/>
-        </w:rPr>
-        <w:t xml:space="preserve">, and broad portfolio-name filters. Its grouped output is A:R: </w:t>
-      </w:r>
-      <w:r>
-        <w:rPr>
-          <w:rFonts w:ascii="Courier New" w:hAnsi="Courier New"/>
-          <w:b w:val="0"/>
-          <w:i w:val="0"/>
-          <w:sz w:val="18"/>
-        </w:rPr>
-        <w:t>PORTNAME, Reclassification, Countrycode, COUNTRY, CITY, CRESTA, COUNTY, STATE, latitude, longitude, ADDRMATCH, Zone3Name, ACCGRPNAME, LIMITCUR, TSI, TSI_NET, TSI_GBP, TSI_USD_NET</w:t>
-      </w:r>
-      <w:r>
-        <w:rPr>
-          <w:b w:val="0"/>
-          <w:i w:val="0"/>
-        </w:rPr>
-        <w:t>.</w:t>
-      </w:r>
-    </w:p>
-    <w:p>
-      <w:r>
-        <w:rPr>
-          <w:b w:val="0"/>
-          <w:i w:val="0"/>
-        </w:rPr>
-        <w:t xml:space="preserve">2. Stop until the currency control is resolved: the output labels </w:t>
-      </w:r>
-      <w:r>
-        <w:rPr>
-          <w:rFonts w:ascii="Courier New" w:hAnsi="Courier New"/>
-          <w:b w:val="0"/>
-          <w:i w:val="0"/>
-          <w:sz w:val="18"/>
-        </w:rPr>
-        <w:t>loccvg.VALUECUR</w:t>
-      </w:r>
-      <w:r>
-        <w:rPr>
-          <w:b w:val="0"/>
-          <w:i w:val="0"/>
-        </w:rPr>
-        <w:t xml:space="preserve"> as </w:t>
+        <w:t xml:space="preserve"> but joins FX on </w:t>
       </w:r>
       <w:r>
         <w:rPr>
@@ -363,7 +1191,67 @@
           <w:b w:val="0"/>
           <w:i w:val="0"/>
         </w:rPr>
-        <w:t xml:space="preserve">, but the FX join uses </w:t>
+        <w:t>. Confirm the currency/scaling basis and unmapped CRESTA treatment.</w:t>
+      </w:r>
+    </w:p>
+    <w:p>
+      <w:r>
+        <w:rPr>
+          <w:b w:val="0"/>
+          <w:i w:val="0"/>
+        </w:rPr>
+        <w:t xml:space="preserve">• </w:t>
+      </w:r>
+      <w:r>
+        <w:rPr>
+          <w:b/>
+          <w:i w:val="0"/>
+        </w:rPr>
+        <w:t>California:</w:t>
+      </w:r>
+      <w:r>
+        <w:rPr>
+          <w:b w:val="0"/>
+          <w:i w:val="0"/>
+        </w:rPr>
+        <w:t xml:space="preserve"> confirm the wildfire proxy and as-of date; the cached report says 2025 while the SQL database is January 2026.</w:t>
+      </w:r>
+    </w:p>
+    <w:p>
+      <w:r>
+        <w:rPr>
+          <w:b w:val="0"/>
+          <w:i w:val="0"/>
+        </w:rPr>
+        <w:t xml:space="preserve">• </w:t>
+      </w:r>
+      <w:r>
+        <w:rPr>
+          <w:b/>
+          <w:i w:val="0"/>
+        </w:rPr>
+        <w:t>ROW:</w:t>
+      </w:r>
+      <w:r>
+        <w:rPr>
+          <w:b w:val="0"/>
+          <w:i w:val="0"/>
+        </w:rPr>
+        <w:t xml:space="preserve"> the supplied query selects only peril/policy type </w:t>
+      </w:r>
+      <w:r>
+        <w:rPr>
+          <w:b/>
+          <w:i w:val="0"/>
+        </w:rPr>
+        <w:t>3/3</w:t>
+      </w:r>
+      <w:r>
+        <w:rPr>
+          <w:b w:val="0"/>
+          <w:i w:val="0"/>
+        </w:rPr>
+        <w:t xml:space="preserve">, not four perils. Existing </w:t>
       </w:r>
       <w:r>
         <w:rPr>
@@ -372,30 +1260,14 @@
           <w:i w:val="0"/>
           <w:sz w:val="18"/>
         </w:rPr>
-        <w:t>loccvg.LIMITCUR</w:t>
+        <w:t>M = I*L</w:t>
       </w:r>
       <w:r>
         <w:rPr>
           <w:b w:val="0"/>
           <w:i w:val="0"/>
         </w:rPr>
-        <w:t xml:space="preserve"> (</w:t>
-      </w:r>
-      <w:r>
-        <w:rPr>
-          <w:rFonts w:ascii="Courier New" w:hAnsi="Courier New"/>
-          <w:b w:val="0"/>
-          <w:i w:val="0"/>
-          <w:sz w:val="18"/>
-        </w:rPr>
-        <w:t>SouthAfrica_Aggs.sql:20,71</w:t>
-      </w:r>
-      <w:r>
-        <w:rPr>
-          <w:b w:val="0"/>
-          <w:i w:val="0"/>
-        </w:rPr>
-        <w:t>). The query also joins account/policy/portfolio tables at account-group grain; capture before/after-join row and amount checks.</w:t>
+        <w:t xml:space="preserve"> uses source-currency net despite its USD label; USD-net is in K. Agree the measure before filling formulas.</w:t>
       </w:r>
     </w:p>
     <w:p>
@@ -404,167 +1276,21 @@
           <w:b w:val="0"/>
           <w:i w:val="0"/>
         </w:rPr>
-        <w:t xml:space="preserve">3. In a working copy of the workbook ending </w:t>
+        <w:t xml:space="preserve">• </w:t>
       </w:r>
       <w:r>
         <w:rPr>
-          <w:rFonts w:ascii="Courier New" w:hAnsi="Courier New"/>
-          <w:b w:val="0"/>
+          <w:b/>
           <w:i w:val="0"/>
-          <w:sz w:val="18"/>
         </w:rPr>
-        <w:t>South Africa EQ - Jan 2026.xlsx</w:t>
+        <w:t>Europe:</w:t>
       </w:r>
       <w:r>
         <w:rPr>
           <w:b w:val="0"/>
           <w:i w:val="0"/>
         </w:rPr>
-        <w:t xml:space="preserve">, preserve </w:t>
-      </w:r>
-      <w:r>
-        <w:rPr>
-          <w:rFonts w:ascii="Courier New" w:hAnsi="Courier New"/>
-          <w:b w:val="0"/>
-          <w:i w:val="0"/>
-          <w:sz w:val="18"/>
-        </w:rPr>
-        <w:t>Core data!S</w:t>
-      </w:r>
-      <w:r>
-        <w:rPr>
-          <w:b w:val="0"/>
-          <w:i w:val="0"/>
-        </w:rPr>
-        <w:t xml:space="preserve"> (</w:t>
-      </w:r>
-      <w:r>
-        <w:rPr>
-          <w:rFonts w:ascii="Courier New" w:hAnsi="Courier New"/>
-          <w:b w:val="0"/>
-          <w:i w:val="0"/>
-          <w:sz w:val="18"/>
-        </w:rPr>
-        <w:t>SCALE_FACTOR</w:t>
-      </w:r>
-      <w:r>
-        <w:rPr>
-          <w:b w:val="0"/>
-          <w:i w:val="0"/>
-        </w:rPr>
-        <w:t xml:space="preserve">) and the helper columns. Paste the approved A:R export into </w:t>
-      </w:r>
-      <w:r>
-        <w:rPr>
-          <w:rFonts w:ascii="Courier New" w:hAnsi="Courier New"/>
-          <w:b w:val="0"/>
-          <w:i w:val="0"/>
-          <w:sz w:val="18"/>
-        </w:rPr>
-        <w:t>Core data!A2</w:t>
-      </w:r>
-      <w:r>
-        <w:rPr>
-          <w:b w:val="0"/>
-          <w:i w:val="0"/>
-        </w:rPr>
-        <w:t xml:space="preserve">, then fill the approved formulas through the complete source range: </w:t>
-      </w:r>
-      <w:r>
-        <w:rPr>
-          <w:rFonts w:ascii="Courier New" w:hAnsi="Courier New"/>
-          <w:b w:val="0"/>
-          <w:i w:val="0"/>
-          <w:sz w:val="18"/>
-        </w:rPr>
-        <w:t>T</w:t>
-      </w:r>
-      <w:r>
-        <w:rPr>
-          <w:b w:val="0"/>
-          <w:i w:val="0"/>
-        </w:rPr>
-        <w:t xml:space="preserve"> is </w:t>
-      </w:r>
-      <w:r>
-        <w:rPr>
-          <w:rFonts w:ascii="Courier New" w:hAnsi="Courier New"/>
-          <w:b w:val="0"/>
-          <w:i w:val="0"/>
-          <w:sz w:val="18"/>
-        </w:rPr>
-        <w:t>S*O</w:t>
-      </w:r>
-      <w:r>
-        <w:rPr>
-          <w:b w:val="0"/>
-          <w:i w:val="0"/>
-        </w:rPr>
-        <w:t xml:space="preserve"> (</w:t>
-      </w:r>
-      <w:r>
-        <w:rPr>
-          <w:rFonts w:ascii="Courier New" w:hAnsi="Courier New"/>
-          <w:b w:val="0"/>
-          <w:i w:val="0"/>
-          <w:sz w:val="18"/>
-        </w:rPr>
-        <w:t>scaled_tsi</w:t>
-      </w:r>
-      <w:r>
-        <w:rPr>
-          <w:b w:val="0"/>
-          <w:i w:val="0"/>
-        </w:rPr>
-        <w:t xml:space="preserve">) and </w:t>
-      </w:r>
-      <w:r>
-        <w:rPr>
-          <w:rFonts w:ascii="Courier New" w:hAnsi="Courier New"/>
-          <w:b w:val="0"/>
-          <w:i w:val="0"/>
-          <w:sz w:val="18"/>
-        </w:rPr>
-        <w:t>U</w:t>
-      </w:r>
-      <w:r>
-        <w:rPr>
-          <w:b w:val="0"/>
-          <w:i w:val="0"/>
-        </w:rPr>
-        <w:t xml:space="preserve"> derives a two-character suffix from </w:t>
-      </w:r>
-      <w:r>
-        <w:rPr>
-          <w:rFonts w:ascii="Courier New" w:hAnsi="Courier New"/>
-          <w:b w:val="0"/>
-          <w:i w:val="0"/>
-          <w:sz w:val="18"/>
-        </w:rPr>
-        <w:t>Zone3Name</w:t>
-      </w:r>
-      <w:r>
-        <w:rPr>
-          <w:b w:val="0"/>
-          <w:i w:val="0"/>
-        </w:rPr>
-        <w:t xml:space="preserve"> (</w:t>
-      </w:r>
-      <w:r>
-        <w:rPr>
-          <w:rFonts w:ascii="Courier New" w:hAnsi="Courier New"/>
-          <w:b w:val="0"/>
-          <w:i w:val="0"/>
-          <w:sz w:val="18"/>
-        </w:rPr>
-        <w:t>cresta_2_digit</w:t>
-      </w:r>
-      <w:r>
-        <w:rPr>
-          <w:b w:val="0"/>
-          <w:i w:val="0"/>
-        </w:rPr>
-        <w:t>). The checked-in workbook seeds these formulas at rows 2:3 and uses shared formulas through row 53; verify the complete approved range after loading rather than assuming its cached helper values are current.</w:t>
+        <w:t xml:space="preserve"> no producer query is supplied. Flood helpers mix source and USD measures, apply old FX and extend beyond the input rows. Resolve the formula and currency basis before refreshing.</w:t>
       </w:r>
     </w:p>
     <w:p>
@@ -573,1016 +1299,23 @@
           <w:b w:val="0"/>
           <w:i w:val="0"/>
         </w:rPr>
-        <w:t xml:space="preserve">4. The report </w:t>
+        <w:t xml:space="preserve">For each report, clear stale input rows, check helper/pivot coverage and unmapped geography, then reconcile totals before refreshing or transferring figures. Detailed defects are in the </w:t>
       </w:r>
-      <w:r>
-        <w:rPr>
-          <w:rFonts w:ascii="Courier New" w:hAnsi="Courier New"/>
-          <w:b w:val="0"/>
-          <w:i w:val="0"/>
-          <w:sz w:val="18"/>
-        </w:rPr>
-        <w:t>05 South Africa EQ Aggs</w:t>
-      </w:r>
+      <w:hyperlink r:id="rId14">
+        <w:r>
+          <w:rPr>
+            <w:color w:val="0563C1"/>
+            <w:u w:val="single"/>
+          </w:rPr>
+          <w:t>discrepancy register</w:t>
+        </w:r>
+      </w:hyperlink>
       <w:r>
         <w:rPr>
           <w:b w:val="0"/>
           <w:i w:val="0"/>
         </w:rPr>
-        <w:t xml:space="preserve"> is dated </w:t>
-      </w:r>
-      <w:r>
-        <w:rPr>
-          <w:rFonts w:ascii="Courier New" w:hAnsi="Courier New"/>
-          <w:b w:val="0"/>
-          <w:i w:val="0"/>
-          <w:sz w:val="18"/>
-        </w:rPr>
-        <w:t>01/01/2024</w:t>
-      </w:r>
-      <w:r>
-        <w:rPr>
-          <w:b w:val="0"/>
-          <w:i w:val="0"/>
-        </w:rPr>
-        <w:t xml:space="preserve"> and its </w:t>
-      </w:r>
-      <w:r>
-        <w:rPr>
-          <w:rFonts w:ascii="Courier New" w:hAnsi="Courier New"/>
-          <w:b w:val="0"/>
-          <w:i w:val="0"/>
-          <w:sz w:val="18"/>
-        </w:rPr>
-        <w:t>C8:C102</w:t>
-      </w:r>
-      <w:r>
-        <w:rPr>
-          <w:b w:val="0"/>
-          <w:i w:val="0"/>
-        </w:rPr>
-        <w:t xml:space="preserve"> formulas sum </w:t>
-      </w:r>
-      <w:r>
-        <w:rPr>
-          <w:rFonts w:ascii="Courier New" w:hAnsi="Courier New"/>
-          <w:b w:val="0"/>
-          <w:i w:val="0"/>
-          <w:sz w:val="18"/>
-        </w:rPr>
-        <w:t>Core data!T:T</w:t>
-      </w:r>
-      <w:r>
-        <w:rPr>
-          <w:b w:val="0"/>
-          <w:i w:val="0"/>
-        </w:rPr>
-        <w:t xml:space="preserve"> by a fixed </w:t>
-      </w:r>
-      <w:r>
-        <w:rPr>
-          <w:rFonts w:ascii="Courier New" w:hAnsi="Courier New"/>
-          <w:b w:val="0"/>
-          <w:i w:val="0"/>
-          <w:sz w:val="18"/>
-        </w:rPr>
-        <w:t>Core data!U1:U53</w:t>
-      </w:r>
-      <w:r>
-        <w:rPr>
-          <w:b w:val="0"/>
-          <w:i w:val="0"/>
-        </w:rPr>
-        <w:t xml:space="preserve"> range. Reconcile this report range, date, scaling, CRESTA coverage, and excluded/unmapped rows before any refresh; do not call the cached report a January-2026 result.</w:t>
-      </w:r>
-    </w:p>
-    <w:p>
-      <w:bookmarkStart w:id="4" w:name="bm_lloyds_runbook_california"/>
-      <w:pPr>
-        <w:pStyle w:val="Heading2"/>
-        <w:keepNext/>
-      </w:pPr>
-      <w:r>
-        <w:rPr>
-          <w:b w:val="0"/>
-          <w:i w:val="0"/>
-        </w:rPr>
-        <w:t>California</w:t>
-      </w:r>
-      <w:bookmarkEnd w:id="4"/>
-    </w:p>
-    <w:p>
-      <w:r>
-        <w:rPr>
-          <w:b w:val="0"/>
-          <w:i w:val="0"/>
-        </w:rPr>
-        <w:t xml:space="preserve">1. Confirm the wildfire proxy/PML, producer, report date, and county mapping before running </w:t>
-      </w:r>
-      <w:r>
-        <w:rPr>
-          <w:rFonts w:ascii="Courier New" w:hAnsi="Courier New"/>
-          <w:b w:val="0"/>
-          <w:i w:val="0"/>
-          <w:sz w:val="18"/>
-        </w:rPr>
-        <w:t>lloyds/sql/FA_California_Aggs.sql</w:t>
-      </w:r>
-      <w:r>
-        <w:rPr>
-          <w:b w:val="0"/>
-          <w:i w:val="0"/>
-        </w:rPr>
-        <w:t xml:space="preserve">. The query hard-codes </w:t>
-      </w:r>
-      <w:r>
-        <w:rPr>
-          <w:rFonts w:ascii="Courier New" w:hAnsi="Courier New"/>
-          <w:b w:val="0"/>
-          <w:i w:val="0"/>
-          <w:sz w:val="18"/>
-        </w:rPr>
-        <w:t>HISCO_UKEU_01JAN26_010126_ROLLUP_ByLOB_GC_v25_EDM</w:t>
-      </w:r>
-      <w:r>
-        <w:rPr>
-          <w:b w:val="0"/>
-          <w:i w:val="0"/>
-        </w:rPr>
-        <w:t xml:space="preserve">, </w:t>
-      </w:r>
-      <w:r>
-        <w:rPr>
-          <w:rFonts w:ascii="Courier New" w:hAnsi="Courier New"/>
-          <w:b w:val="0"/>
-          <w:i w:val="0"/>
-          <w:sz w:val="18"/>
-        </w:rPr>
-        <w:t>PERIL = 4</w:t>
-      </w:r>
-      <w:r>
-        <w:rPr>
-          <w:b w:val="0"/>
-          <w:i w:val="0"/>
-        </w:rPr>
-        <w:t xml:space="preserve">, </w:t>
-      </w:r>
-      <w:r>
-        <w:rPr>
-          <w:rFonts w:ascii="Courier New" w:hAnsi="Courier New"/>
-          <w:b w:val="0"/>
-          <w:i w:val="0"/>
-          <w:sz w:val="18"/>
-        </w:rPr>
-        <w:t>POLICYTYPE = 4</w:t>
-      </w:r>
-      <w:r>
-        <w:rPr>
-          <w:b w:val="0"/>
-          <w:i w:val="0"/>
-        </w:rPr>
-        <w:t xml:space="preserve">, California/US scope, and the same broad portfolio filter. It returns A:M: </w:t>
-      </w:r>
-      <w:r>
-        <w:rPr>
-          <w:rFonts w:ascii="Courier New" w:hAnsi="Courier New"/>
-          <w:b w:val="0"/>
-          <w:i w:val="0"/>
-          <w:sz w:val="18"/>
-        </w:rPr>
-        <w:t>PORTNAME, cntrycode, COUNTRY, statecode, county, cresta, accgrpid, ACCGRPNUM, Currency, TSI, TSI_NET, TSI_GBP, TSI_USD_NET</w:t>
-      </w:r>
-      <w:r>
-        <w:rPr>
-          <w:b w:val="0"/>
-          <w:i w:val="0"/>
-        </w:rPr>
-        <w:t>; it does not itself establish a wildfire PML or approved proxy.</w:t>
-      </w:r>
-    </w:p>
-    <w:p>
-      <w:r>
-        <w:rPr>
-          <w:b w:val="0"/>
-          <w:i w:val="0"/>
-        </w:rPr>
-        <w:t xml:space="preserve">2. In a working copy of the workbook ending </w:t>
-      </w:r>
-      <w:r>
-        <w:rPr>
-          <w:rFonts w:ascii="Courier New" w:hAnsi="Courier New"/>
-          <w:b w:val="0"/>
-          <w:i w:val="0"/>
-          <w:sz w:val="18"/>
-        </w:rPr>
-        <w:t>California WF.xlsx</w:t>
-      </w:r>
-      <w:r>
-        <w:rPr>
-          <w:b w:val="0"/>
-          <w:i w:val="0"/>
-        </w:rPr>
-        <w:t xml:space="preserve">, paste the approved A:M export into </w:t>
-      </w:r>
-      <w:r>
-        <w:rPr>
-          <w:rFonts w:ascii="Courier New" w:hAnsi="Courier New"/>
-          <w:b w:val="0"/>
-          <w:i w:val="0"/>
-          <w:sz w:val="18"/>
-        </w:rPr>
-        <w:t>Core data!A2</w:t>
-      </w:r>
-      <w:r>
-        <w:rPr>
-          <w:b w:val="0"/>
-          <w:i w:val="0"/>
-        </w:rPr>
-        <w:t xml:space="preserve">, preserve N, and fill the county helper through the complete source range. </w:t>
-      </w:r>
-      <w:r>
-        <w:rPr>
-          <w:rFonts w:ascii="Courier New" w:hAnsi="Courier New"/>
-          <w:b w:val="0"/>
-          <w:i w:val="0"/>
-          <w:sz w:val="18"/>
-        </w:rPr>
-        <w:t>Core data!N</w:t>
-      </w:r>
-      <w:r>
-        <w:rPr>
-          <w:b w:val="0"/>
-          <w:i w:val="0"/>
-        </w:rPr>
-        <w:t xml:space="preserve"> extracts text before </w:t>
-      </w:r>
-      <w:r>
-        <w:rPr>
-          <w:rFonts w:ascii="Courier New" w:hAnsi="Courier New"/>
-          <w:b w:val="0"/>
-          <w:i w:val="0"/>
-          <w:sz w:val="18"/>
-        </w:rPr>
-        <w:t>"County"</w:t>
-      </w:r>
-      <w:r>
-        <w:rPr>
-          <w:b w:val="0"/>
-          <w:i w:val="0"/>
-        </w:rPr>
-        <w:t xml:space="preserve"> from column E, while </w:t>
-      </w:r>
-      <w:r>
-        <w:rPr>
-          <w:rFonts w:ascii="Courier New" w:hAnsi="Courier New"/>
-          <w:b w:val="0"/>
-          <w:i w:val="0"/>
-          <w:sz w:val="18"/>
-        </w:rPr>
-        <w:t>06 California Wildfire Aggs!C8:C65</w:t>
-      </w:r>
-      <w:r>
-        <w:rPr>
-          <w:b w:val="0"/>
-          <w:i w:val="0"/>
-        </w:rPr>
-        <w:t xml:space="preserve"> sums column M by that helper. Check blank/non-matching county values and formula errors rather than silently dropping them.</w:t>
-      </w:r>
-    </w:p>
-    <w:p>
-      <w:r>
-        <w:rPr>
-          <w:b w:val="0"/>
-          <w:i w:val="0"/>
-        </w:rPr>
-        <w:t xml:space="preserve">3. The checked-in report says </w:t>
-      </w:r>
-      <w:r>
-        <w:rPr>
-          <w:rFonts w:ascii="Courier New" w:hAnsi="Courier New"/>
-          <w:b w:val="0"/>
-          <w:i w:val="0"/>
-          <w:sz w:val="18"/>
-        </w:rPr>
-        <w:t>Static property exposure data as at 01/01/2025 (USD units)</w:t>
-      </w:r>
-      <w:r>
-        <w:rPr>
-          <w:b w:val="0"/>
-          <w:i w:val="0"/>
-        </w:rPr>
-        <w:t xml:space="preserve"> (</w:t>
-      </w:r>
-      <w:r>
-        <w:rPr>
-          <w:rFonts w:ascii="Courier New" w:hAnsi="Courier New"/>
-          <w:b w:val="0"/>
-          <w:i w:val="0"/>
-          <w:sz w:val="18"/>
-        </w:rPr>
-        <w:t>06 California Wildfire Aggs!B3</w:t>
-      </w:r>
-      <w:r>
-        <w:rPr>
-          <w:b w:val="0"/>
-          <w:i w:val="0"/>
-        </w:rPr>
-        <w:t>), whereas the SQL database name is a January-2026 EDM. Resolve the as-of date, lineage, proxy/PML, and currency before using or refreshing the report.</w:t>
-      </w:r>
-    </w:p>
-    <w:p>
-      <w:bookmarkStart w:id="5" w:name="bm_lloyds_runbook_rest_of_world"/>
-      <w:pPr>
-        <w:pStyle w:val="Heading2"/>
-        <w:keepNext/>
-      </w:pPr>
-      <w:r>
-        <w:rPr>
-          <w:b w:val="0"/>
-          <w:i w:val="0"/>
-        </w:rPr>
-        <w:t>Rest of World</w:t>
-      </w:r>
-      <w:bookmarkEnd w:id="5"/>
-    </w:p>
-    <w:p>
-      <w:r>
-        <w:rPr>
-          <w:b w:val="0"/>
-          <w:i w:val="0"/>
-        </w:rPr>
-        <w:t xml:space="preserve">1. Obtain separately approved EQ, FR, FL, and WS extracts. The checked-in </w:t>
-      </w:r>
-      <w:r>
-        <w:rPr>
-          <w:rFonts w:ascii="Courier New" w:hAnsi="Courier New"/>
-          <w:b w:val="0"/>
-          <w:i w:val="0"/>
-          <w:sz w:val="18"/>
-        </w:rPr>
-        <w:t>lloyds/sql/Supplementary Info - Workings - ROW Aggs - SQL.sql</w:t>
-      </w:r>
-      <w:r>
-        <w:rPr>
-          <w:b w:val="0"/>
-          <w:i w:val="0"/>
-        </w:rPr>
-        <w:t xml:space="preserve"> is not four peril queries: it hard-codes </w:t>
-      </w:r>
-      <w:r>
-        <w:rPr>
-          <w:rFonts w:ascii="Courier New" w:hAnsi="Courier New"/>
-          <w:b w:val="0"/>
-          <w:i w:val="0"/>
-          <w:sz w:val="18"/>
-        </w:rPr>
-        <w:t>PERIL = 3</w:t>
-      </w:r>
-      <w:r>
-        <w:rPr>
-          <w:b w:val="0"/>
-          <w:i w:val="0"/>
-        </w:rPr>
-        <w:t xml:space="preserve"> and </w:t>
-      </w:r>
-      <w:r>
-        <w:rPr>
-          <w:rFonts w:ascii="Courier New" w:hAnsi="Courier New"/>
-          <w:b w:val="0"/>
-          <w:i w:val="0"/>
-          <w:sz w:val="18"/>
-        </w:rPr>
-        <w:t>POLICYTYPE = 3</w:t>
-      </w:r>
-      <w:r>
-        <w:rPr>
-          <w:b w:val="0"/>
-          <w:i w:val="0"/>
-        </w:rPr>
-        <w:t xml:space="preserve">, and filters portfolio names with </w:t>
-      </w:r>
-      <w:r>
-        <w:rPr>
-          <w:rFonts w:ascii="Courier New" w:hAnsi="Courier New"/>
-          <w:b w:val="0"/>
-          <w:i w:val="0"/>
-          <w:sz w:val="18"/>
-        </w:rPr>
-        <w:t>%33%</w:t>
-      </w:r>
-      <w:r>
-        <w:rPr>
-          <w:b w:val="0"/>
-          <w:i w:val="0"/>
-        </w:rPr>
-        <w:t xml:space="preserve"> or </w:t>
-      </w:r>
-      <w:r>
-        <w:rPr>
-          <w:rFonts w:ascii="Courier New" w:hAnsi="Courier New"/>
-          <w:b w:val="0"/>
-          <w:i w:val="0"/>
-          <w:sz w:val="18"/>
-        </w:rPr>
-        <w:t>%3624%</w:t>
-      </w:r>
-      <w:r>
-        <w:rPr>
-          <w:b w:val="0"/>
-          <w:i w:val="0"/>
-        </w:rPr>
-        <w:t xml:space="preserve">. Its grouped A:K output is </w:t>
-      </w:r>
-      <w:r>
-        <w:rPr>
-          <w:rFonts w:ascii="Courier New" w:hAnsi="Courier New"/>
-          <w:b w:val="0"/>
-          <w:i w:val="0"/>
-          <w:sz w:val="18"/>
-        </w:rPr>
-        <w:t>PORTNAME, Reclassification, Countrycode, COUNTRY, accgrpid, ACCGRPNUM, Currency, TSI, TSI_NET, TSI_GBP, TSI_USD_NET</w:t>
-      </w:r>
-      <w:r>
-        <w:rPr>
-          <w:b w:val="0"/>
-          <w:i w:val="0"/>
-        </w:rPr>
-        <w:t>. It also reads live FX and joins policy/portfolio membership at account-group grain. Treat its output as a single candidate extract, not as four approved perils.</w:t>
-      </w:r>
-    </w:p>
-    <w:p>
-      <w:r>
-        <w:rPr>
-          <w:b w:val="0"/>
-          <w:i w:val="0"/>
-        </w:rPr>
-        <w:t xml:space="preserve">2. In the workbook ending </w:t>
-      </w:r>
-      <w:r>
-        <w:rPr>
-          <w:rFonts w:ascii="Courier New" w:hAnsi="Courier New"/>
-          <w:b w:val="0"/>
-          <w:i w:val="0"/>
-          <w:sz w:val="18"/>
-        </w:rPr>
-        <w:t>ROW.xlsx</w:t>
-      </w:r>
-      <w:r>
-        <w:rPr>
-          <w:b w:val="0"/>
-          <w:i w:val="0"/>
-        </w:rPr>
-        <w:t>, paste each approved A:K extract with headers into row 2 of the matching sheets (</w:t>
-      </w:r>
-      <w:r>
-        <w:rPr>
-          <w:rFonts w:ascii="Courier New" w:hAnsi="Courier New"/>
-          <w:b w:val="0"/>
-          <w:i w:val="0"/>
-          <w:sz w:val="18"/>
-        </w:rPr>
-        <w:t>EQ Extract - Open Market</w:t>
-      </w:r>
-      <w:r>
-        <w:rPr>
-          <w:b w:val="0"/>
-          <w:i w:val="0"/>
-        </w:rPr>
-        <w:t xml:space="preserve">, </w:t>
-      </w:r>
-      <w:r>
-        <w:rPr>
-          <w:rFonts w:ascii="Courier New" w:hAnsi="Courier New"/>
-          <w:b w:val="0"/>
-          <w:i w:val="0"/>
-          <w:sz w:val="18"/>
-        </w:rPr>
-        <w:t>FR Extract  - Open Market</w:t>
-      </w:r>
-      <w:r>
-        <w:rPr>
-          <w:b w:val="0"/>
-          <w:i w:val="0"/>
-        </w:rPr>
-        <w:t xml:space="preserve"> [two spaces before </w:t>
-      </w:r>
-      <w:r>
-        <w:rPr>
-          <w:rFonts w:ascii="Courier New" w:hAnsi="Courier New"/>
-          <w:b w:val="0"/>
-          <w:i w:val="0"/>
-          <w:sz w:val="18"/>
-        </w:rPr>
-        <w:t>-</w:t>
-      </w:r>
-      <w:r>
-        <w:rPr>
-          <w:b w:val="0"/>
-          <w:i w:val="0"/>
-        </w:rPr>
-        <w:t xml:space="preserve">], </w:t>
-      </w:r>
-      <w:r>
-        <w:rPr>
-          <w:rFonts w:ascii="Courier New" w:hAnsi="Courier New"/>
-          <w:b w:val="0"/>
-          <w:i w:val="0"/>
-          <w:sz w:val="18"/>
-        </w:rPr>
-        <w:t>FL Extract - Open Market</w:t>
-      </w:r>
-      <w:r>
-        <w:rPr>
-          <w:b w:val="0"/>
-          <w:i w:val="0"/>
-        </w:rPr>
-        <w:t xml:space="preserve">, and </w:t>
-      </w:r>
-      <w:r>
-        <w:rPr>
-          <w:rFonts w:ascii="Courier New" w:hAnsi="Courier New"/>
-          <w:b w:val="0"/>
-          <w:i w:val="0"/>
-          <w:sz w:val="18"/>
-        </w:rPr>
-        <w:t>WS Extract - Open Market</w:t>
-      </w:r>
-      <w:r>
-        <w:rPr>
-          <w:b w:val="0"/>
-          <w:i w:val="0"/>
-        </w:rPr>
-        <w:t>). Preserve L and fill approved M formulas (</w:t>
-      </w:r>
-      <w:r>
-        <w:rPr>
-          <w:rFonts w:ascii="Courier New" w:hAnsi="Courier New"/>
-          <w:b w:val="0"/>
-          <w:i w:val="0"/>
-          <w:sz w:val="18"/>
-        </w:rPr>
-        <w:t>TSI_USD_Scaled = I*L</w:t>
-      </w:r>
-      <w:r>
-        <w:rPr>
-          <w:b w:val="0"/>
-          <w:i w:val="0"/>
-        </w:rPr>
-        <w:t>) through the complete source range. Retain the scale-factor source and reconcile source, USD, net, and scaled measures separately.</w:t>
-      </w:r>
-    </w:p>
-    <w:p>
-      <w:r>
-        <w:rPr>
-          <w:b w:val="0"/>
-          <w:i w:val="0"/>
-        </w:rPr>
-        <w:t xml:space="preserve">3. Do not infer row counts from worksheet dimensions. Current defined/filter ranges include EQ/FR </w:t>
-      </w:r>
-      <w:r>
-        <w:rPr>
-          <w:rFonts w:ascii="Courier New" w:hAnsi="Courier New"/>
-          <w:b w:val="0"/>
-          <w:i w:val="0"/>
-          <w:sz w:val="18"/>
-        </w:rPr>
-        <w:t>A1:M6757</w:t>
-      </w:r>
-      <w:r>
-        <w:rPr>
-          <w:b w:val="0"/>
-          <w:i w:val="0"/>
-        </w:rPr>
-        <w:t xml:space="preserve">, FL </w:t>
-      </w:r>
-      <w:r>
-        <w:rPr>
-          <w:rFonts w:ascii="Courier New" w:hAnsi="Courier New"/>
-          <w:b w:val="0"/>
-          <w:i w:val="0"/>
-          <w:sz w:val="18"/>
-        </w:rPr>
-        <w:t>A1:T5676</w:t>
-      </w:r>
-      <w:r>
-        <w:rPr>
-          <w:b w:val="0"/>
-          <w:i w:val="0"/>
-        </w:rPr>
-        <w:t xml:space="preserve">, and WS </w:t>
-      </w:r>
-      <w:r>
-        <w:rPr>
-          <w:rFonts w:ascii="Courier New" w:hAnsi="Courier New"/>
-          <w:b w:val="0"/>
-          <w:i w:val="0"/>
-          <w:sz w:val="18"/>
-        </w:rPr>
-        <w:t>A1:M4988</w:t>
-      </w:r>
-      <w:r>
-        <w:rPr>
-          <w:b w:val="0"/>
-          <w:i w:val="0"/>
-        </w:rPr>
-        <w:t xml:space="preserve">, while stale helper rows/formulas extend beyond some of those ranges. Reconcile headers, rows, totals, currencies, and stale helper errors before changing pivot sources. Then refresh </w:t>
-      </w:r>
-      <w:r>
-        <w:rPr>
-          <w:rFonts w:ascii="Courier New" w:hAnsi="Courier New"/>
-          <w:b w:val="0"/>
-          <w:i w:val="0"/>
-          <w:sz w:val="18"/>
-        </w:rPr>
-        <w:t>3. RoW Exposure Monitoring</w:t>
-      </w:r>
-      <w:r>
-        <w:rPr>
-          <w:b w:val="0"/>
-          <w:i w:val="0"/>
-        </w:rPr>
-        <w:t xml:space="preserve"> only after its country/peril mapping and pivot-range changes are approved.</w:t>
-      </w:r>
-    </w:p>
-    <w:p>
-      <w:r>
-        <w:rPr>
-          <w:b w:val="0"/>
-          <w:i w:val="0"/>
-        </w:rPr>
-        <w:t xml:space="preserve">4. The report is labelled </w:t>
-      </w:r>
-      <w:r>
-        <w:rPr>
-          <w:rFonts w:ascii="Courier New" w:hAnsi="Courier New"/>
-          <w:b w:val="0"/>
-          <w:i w:val="0"/>
-          <w:sz w:val="18"/>
-        </w:rPr>
-        <w:t>Exposure data as at 1st Jan 2026 (USD units)</w:t>
-      </w:r>
-      <w:r>
-        <w:rPr>
-          <w:b w:val="0"/>
-          <w:i w:val="0"/>
-        </w:rPr>
-        <w:t xml:space="preserve"> but the SQL is not a four-peril producer and the workbook contains broken defined names/external links. Do not blindly refresh links or present the cached report as a lineage-complete submission.</w:t>
-      </w:r>
-    </w:p>
-    <w:p>
-      <w:bookmarkStart w:id="6" w:name="bm_lloyds_runbook_europe"/>
-      <w:pPr>
-        <w:pStyle w:val="Heading2"/>
-        <w:keepNext/>
-      </w:pPr>
-      <w:r>
-        <w:rPr>
-          <w:b w:val="0"/>
-          <w:i w:val="0"/>
-        </w:rPr>
-        <w:t>Europe</w:t>
-      </w:r>
-      <w:bookmarkEnd w:id="6"/>
-    </w:p>
-    <w:p>
-      <w:r>
-        <w:rPr>
-          <w:b w:val="0"/>
-          <w:i w:val="0"/>
-        </w:rPr>
-        <w:t xml:space="preserve">1. Obtain separately approved earthquake and flood extracts. There is no matching EU producer/query in the repository; </w:t>
-      </w:r>
-      <w:r>
-        <w:rPr>
-          <w:rFonts w:ascii="Courier New" w:hAnsi="Courier New"/>
-          <w:b w:val="0"/>
-          <w:i w:val="0"/>
-          <w:sz w:val="18"/>
-        </w:rPr>
-        <w:t>lloyds/sql/rds-event-select.sql</w:t>
-      </w:r>
-      <w:r>
-        <w:rPr>
-          <w:b w:val="0"/>
-          <w:i w:val="0"/>
-        </w:rPr>
-        <w:t xml:space="preserve"> is empty. The checked-in EU workbook is therefore not a runnable SQL workflow.</w:t>
-      </w:r>
-    </w:p>
-    <w:p>
-      <w:r>
-        <w:rPr>
-          <w:b w:val="0"/>
-          <w:i w:val="0"/>
-        </w:rPr>
-        <w:t xml:space="preserve">2. In a working copy of the workbook ending </w:t>
-      </w:r>
-      <w:r>
-        <w:rPr>
-          <w:rFonts w:ascii="Courier New" w:hAnsi="Courier New"/>
-          <w:b w:val="0"/>
-          <w:i w:val="0"/>
-          <w:sz w:val="18"/>
-        </w:rPr>
-        <w:t>EU Cresta.xlsx</w:t>
-      </w:r>
-      <w:r>
-        <w:rPr>
-          <w:b w:val="0"/>
-          <w:i w:val="0"/>
-        </w:rPr>
-        <w:t xml:space="preserve">, paste approved source columns A:R into </w:t>
-      </w:r>
-      <w:r>
-        <w:rPr>
-          <w:rFonts w:ascii="Courier New" w:hAnsi="Courier New"/>
-          <w:b w:val="0"/>
-          <w:i w:val="0"/>
-          <w:sz w:val="18"/>
-        </w:rPr>
-        <w:t>Core data EQ!A2</w:t>
-      </w:r>
-      <w:r>
-        <w:rPr>
-          <w:b w:val="0"/>
-          <w:i w:val="0"/>
-        </w:rPr>
-        <w:t xml:space="preserve"> and </w:t>
-      </w:r>
-      <w:r>
-        <w:rPr>
-          <w:rFonts w:ascii="Courier New" w:hAnsi="Courier New"/>
-          <w:b w:val="0"/>
-          <w:i w:val="0"/>
-          <w:sz w:val="18"/>
-        </w:rPr>
-        <w:t>Core data FL!A2</w:t>
-      </w:r>
-      <w:r>
-        <w:rPr>
-          <w:b w:val="0"/>
-          <w:i w:val="0"/>
-        </w:rPr>
-        <w:t xml:space="preserve">, preserve S:U, and verify scale and formula coverage before refresh. The report </w:t>
-      </w:r>
-      <w:r>
-        <w:rPr>
-          <w:rFonts w:ascii="Courier New" w:hAnsi="Courier New"/>
-          <w:b w:val="0"/>
-          <w:i w:val="0"/>
-          <w:sz w:val="18"/>
-        </w:rPr>
-        <w:t>11 LIC EU CRESTA</w:t>
-      </w:r>
-      <w:r>
-        <w:rPr>
-          <w:b w:val="0"/>
-          <w:i w:val="0"/>
-        </w:rPr>
-        <w:t xml:space="preserve"> sums </w:t>
-      </w:r>
-      <w:r>
-        <w:rPr>
-          <w:rFonts w:ascii="Courier New" w:hAnsi="Courier New"/>
-          <w:b w:val="0"/>
-          <w:i w:val="0"/>
-          <w:sz w:val="18"/>
-        </w:rPr>
-        <w:t>Core data EQ!U:U</w:t>
-      </w:r>
-      <w:r>
-        <w:rPr>
-          <w:b w:val="0"/>
-          <w:i w:val="0"/>
-        </w:rPr>
-        <w:t xml:space="preserve"> and </w:t>
-      </w:r>
-      <w:r>
-        <w:rPr>
-          <w:rFonts w:ascii="Courier New" w:hAnsi="Courier New"/>
-          <w:b w:val="0"/>
-          <w:i w:val="0"/>
-          <w:sz w:val="18"/>
-        </w:rPr>
-        <w:t>Core data FL!U:U</w:t>
-      </w:r>
-      <w:r>
-        <w:rPr>
-          <w:b w:val="0"/>
-          <w:i w:val="0"/>
-        </w:rPr>
-        <w:t xml:space="preserve"> by CRESTA keys in columns C and G.</w:t>
-      </w:r>
-    </w:p>
-    <w:p>
-      <w:r>
-        <w:rPr>
-          <w:b w:val="0"/>
-          <w:i w:val="0"/>
-        </w:rPr>
-        <w:t xml:space="preserve">3. Stop on the current measure/FX defect. </w:t>
-      </w:r>
-      <w:r>
-        <w:rPr>
-          <w:rFonts w:ascii="Courier New" w:hAnsi="Courier New"/>
-          <w:b w:val="0"/>
-          <w:i w:val="0"/>
-          <w:sz w:val="18"/>
-        </w:rPr>
-        <w:t>Core data FL</w:t>
-      </w:r>
-      <w:r>
-        <w:rPr>
-          <w:b w:val="0"/>
-          <w:i w:val="0"/>
-        </w:rPr>
-        <w:t xml:space="preserve"> uses </w:t>
-      </w:r>
-      <w:r>
-        <w:rPr>
-          <w:rFonts w:ascii="Courier New" w:hAnsi="Courier New"/>
-          <w:b w:val="0"/>
-          <w:i w:val="0"/>
-          <w:sz w:val="18"/>
-        </w:rPr>
-        <w:t>T2=S2*R2</w:t>
-      </w:r>
-      <w:r>
-        <w:rPr>
-          <w:b w:val="0"/>
-          <w:i w:val="0"/>
-        </w:rPr>
-        <w:t xml:space="preserve">, </w:t>
-      </w:r>
-      <w:r>
-        <w:rPr>
-          <w:rFonts w:ascii="Courier New" w:hAnsi="Courier New"/>
-          <w:b w:val="0"/>
-          <w:i w:val="0"/>
-          <w:sz w:val="18"/>
-        </w:rPr>
-        <w:t>T3:T7822=S*P</w:t>
-      </w:r>
-      <w:r>
-        <w:rPr>
-          <w:b w:val="0"/>
-          <w:i w:val="0"/>
-        </w:rPr>
-        <w:t xml:space="preserve">, and </w:t>
-      </w:r>
-      <w:r>
-        <w:rPr>
-          <w:rFonts w:ascii="Courier New" w:hAnsi="Courier New"/>
-          <w:b w:val="0"/>
-          <w:i w:val="0"/>
-          <w:sz w:val="18"/>
-        </w:rPr>
-        <w:t>T7823:T7891=S*R</w:t>
-      </w:r>
-      <w:r>
-        <w:rPr>
-          <w:b w:val="0"/>
-          <w:i w:val="0"/>
-        </w:rPr>
-        <w:t xml:space="preserve">; every U row then applies </w:t>
-      </w:r>
-      <w:r>
-        <w:rPr>
-          <w:rFonts w:ascii="Courier New" w:hAnsi="Courier New"/>
-          <w:b w:val="0"/>
-          <w:i w:val="0"/>
-          <w:sz w:val="18"/>
-        </w:rPr>
-        <w:t>T*Fx!$C$7</w:t>
-      </w:r>
-      <w:r>
-        <w:rPr>
-          <w:b w:val="0"/>
-          <w:i w:val="0"/>
-        </w:rPr>
-        <w:t xml:space="preserve">, where </w:t>
-      </w:r>
-      <w:r>
-        <w:rPr>
-          <w:rFonts w:ascii="Courier New" w:hAnsi="Courier New"/>
-          <w:b w:val="0"/>
-          <w:i w:val="0"/>
-          <w:sz w:val="18"/>
-        </w:rPr>
-        <w:t>Fx!C7 = 1.25/1.21</w:t>
-      </w:r>
-      <w:r>
-        <w:rPr>
-          <w:b w:val="0"/>
-          <w:i w:val="0"/>
-        </w:rPr>
-        <w:t xml:space="preserve">. The report is labelled </w:t>
-      </w:r>
-      <w:r>
-        <w:rPr>
-          <w:rFonts w:ascii="Courier New" w:hAnsi="Courier New"/>
-          <w:b w:val="0"/>
-          <w:i w:val="0"/>
-          <w:sz w:val="18"/>
-        </w:rPr>
-        <w:t>As at 01/07/2024 (EURO units)</w:t>
-      </w:r>
-      <w:r>
-        <w:rPr>
-          <w:b w:val="0"/>
-          <w:i w:val="0"/>
-        </w:rPr>
-        <w:t>. The FL source/filter ends at row 7,891, but helper formulas continue through row 8,699; quarantine those trailing rows before changing ranges. Do not fill down, refresh, or describe this as a current EUR result until the source measure, FX basis/direction/date, and uniform formula pattern are approved and reconciled.</w:t>
-      </w:r>
-    </w:p>
-    <w:p>
-      <w:r>
-        <w:rPr>
-          <w:b w:val="0"/>
-          <w:i w:val="0"/>
-        </w:rPr>
-        <w:t>4. Reconcile unmatched/blank/</w:t>
-      </w:r>
-      <w:r>
-        <w:rPr>
-          <w:rFonts w:ascii="Courier New" w:hAnsi="Courier New"/>
-          <w:b w:val="0"/>
-          <w:i w:val="0"/>
-          <w:sz w:val="18"/>
-        </w:rPr>
-        <w:t>GBR_*</w:t>
-      </w:r>
-      <w:r>
-        <w:rPr>
-          <w:b w:val="0"/>
-          <w:i w:val="0"/>
-        </w:rPr>
-        <w:t xml:space="preserve"> CRESTA keys and all included plus excluded exposure before using </w:t>
-      </w:r>
-      <w:r>
-        <w:rPr>
-          <w:rFonts w:ascii="Courier New" w:hAnsi="Courier New"/>
-          <w:b w:val="0"/>
-          <w:i w:val="0"/>
-          <w:sz w:val="18"/>
-        </w:rPr>
-        <w:t>11 LIC EU CRESTA</w:t>
-      </w:r>
-      <w:r>
-        <w:rPr>
-          <w:b w:val="0"/>
-          <w:i w:val="0"/>
-        </w:rPr>
-        <w:t>. Preserve the source workbook and any received instructions as provenance.</w:t>
-      </w:r>
-    </w:p>
-    <w:p>
-      <w:bookmarkStart w:id="7" w:name="bm_lloyds_runbook_finish"/>
-      <w:pPr>
-        <w:pStyle w:val="Heading2"/>
-        <w:keepNext/>
-      </w:pPr>
-      <w:r>
-        <w:rPr>
-          <w:b w:val="0"/>
-          <w:i w:val="0"/>
-        </w:rPr>
-        <w:t>Finish</w:t>
-      </w:r>
-      <w:bookmarkEnd w:id="7"/>
-    </w:p>
-    <w:p>
-      <w:r>
-        <w:rPr>
-          <w:b w:val="0"/>
-          <w:i w:val="0"/>
-        </w:rPr>
-        <w:t>1. Check currency, units, scales, dates, missing geography, unmapped CRESTA or county values, stale rows, external links, and formula errors. Clear only controlled source rows; never overwrite headers, formulas, mappings, pivots, validation, or raw evidence.</w:t>
-      </w:r>
-    </w:p>
-    <w:p>
-      <w:r>
-        <w:rPr>
-          <w:b w:val="0"/>
-          <w:i w:val="0"/>
-        </w:rPr>
-        <w:t>2. Reconcile each report at its stated grain to the approved extract, including all agreed exclusions and source-to-USD/EUR movements. Save the reviewed workbook and raw/grouped outputs together in a run-specific location.</w:t>
-      </w:r>
-    </w:p>
-    <w:p>
-      <w:r>
-        <w:rPr>
-          <w:b/>
-          <w:i w:val="0"/>
-        </w:rPr>
-        <w:t>Still needed:</w:t>
-      </w:r>
-      <w:r>
-        <w:rPr>
-          <w:b w:val="0"/>
-          <w:i w:val="0"/>
-        </w:rPr>
-        <w:t xml:space="preserve"> the final Lloyd's submission template and destination-cell map for all four branches, plus approved producers/proxies, source lineage, and reviewer sign-off.</w:t>
+        <w:t>. Contingency/weather workbooks are a separate workflow, not covered here.</w:t>
       </w:r>
     </w:p>
     <w:sectPr>

</xml_diff>